<commit_message>
Fix sale contract page overflow
</commit_message>
<xml_diff>
--- a/contract-pdf-work/templates/Umowa_Sprzedazy_AG_template.docx
+++ b/contract-pdf-work/templates/Umowa_Sprzedazy_AG_template.docx
@@ -1,6 +1,6 @@
 
 <file path=word/document.xml><?xml version="1.0" encoding="utf-8"?>
-<w:document xmlns:wpc="http://schemas.microsoft.com/office/word/2010/wordprocessingCanvas" xmlns:cx="http://schemas.microsoft.com/office/drawing/2014/chartex" xmlns:cx1="http://schemas.microsoft.com/office/drawing/2015/9/8/chartex" xmlns:cx2="http://schemas.microsoft.com/office/drawing/2015/10/21/chartex" xmlns:cx3="http://schemas.microsoft.com/office/drawing/2016/5/9/chartex" xmlns:cx4="http://schemas.microsoft.com/office/drawing/2016/5/10/chartex" xmlns:cx5="http://schemas.microsoft.com/office/drawing/2016/5/11/chartex" xmlns:cx6="http://schemas.microsoft.com/office/drawing/2016/5/12/chartex" xmlns:cx7="http://schemas.microsoft.com/office/drawing/2016/5/13/chartex" xmlns:cx8="http://schemas.microsoft.com/office/drawing/2016/5/14/chartex" xmlns:mc="http://schemas.openxmlformats.org/markup-compatibility/2006" xmlns:aink="http://schemas.microsoft.com/office/drawing/2016/ink" xmlns:am3d="http://schemas.microsoft.com/office/drawing/2017/model3d" xmlns:o="urn:schemas-microsoft-com:office:office" xmlns:oel="http://schemas.microsoft.com/office/2019/extlst" xmlns:r="http://schemas.openxmlformats.org/officeDocument/2006/relationships" xmlns:m="http://schemas.openxmlformats.org/officeDocument/2006/math" xmlns:v="urn:schemas-microsoft-com:vml" xmlns:wp14="http://schemas.microsoft.com/office/word/2010/wordprocessingDrawing" xmlns:wp="http://schemas.openxmlformats.org/drawingml/2006/wordprocessingDrawing" xmlns:w10="urn:schemas-microsoft-com:office:word" xmlns:w="http://schemas.openxmlformats.org/wordprocessingml/2006/main" xmlns:w14="http://schemas.microsoft.com/office/word/2010/wordml" xmlns:w15="http://schemas.microsoft.com/office/word/2012/wordml" xmlns:w16cex="http://schemas.microsoft.com/office/word/2018/wordml/cex" xmlns:w16cid="http://schemas.microsoft.com/office/word/2016/wordml/cid" xmlns:w16="http://schemas.microsoft.com/office/word/2018/wordml" xmlns:w16sdtdh="http://schemas.microsoft.com/office/word/2020/wordml/sdtdatahash" xmlns:w16se="http://schemas.microsoft.com/office/word/2015/wordml/symex" xmlns:wpg="http://schemas.microsoft.com/office/word/2010/wordprocessingGroup" xmlns:wpi="http://schemas.microsoft.com/office/word/2010/wordprocessingInk" xmlns:wne="http://schemas.microsoft.com/office/word/2006/wordml" xmlns:wps="http://schemas.microsoft.com/office/word/2010/wordprocessingShape" mc:Ignorable="w14 w15 w16se w16cid w16 w16cex w16sdtdh wp14">
+<w:document xmlns:a="http://schemas.openxmlformats.org/drawingml/2006/main" xmlns:ns1="http://schemas.openxmlformats.org/markup-compatibility/2006" xmlns:ns5="http://schemas.microsoft.com/office/word/2010/wordprocessingDrawing" xmlns:ns8="http://schemas.microsoft.com/office/drawing/2010/main" xmlns:pic="http://schemas.openxmlformats.org/drawingml/2006/picture" xmlns:r="http://schemas.openxmlformats.org/officeDocument/2006/relationships" xmlns:w="http://schemas.openxmlformats.org/wordprocessingml/2006/main" xmlns:w14="http://schemas.microsoft.com/office/word/2010/wordml" xmlns:wp="http://schemas.openxmlformats.org/drawingml/2006/wordprocessingDrawing" ns1:Ignorable="w14 w15 w16se w16cid w16 w16cex w16sdtdh wp14">
   <w:body>
     <w:tbl>
       <w:tblPr>
@@ -459,16 +459,16 @@
                 <w:noProof/>
               </w:rPr>
               <w:drawing>
-                <wp:inline distT="0" distB="0" distL="0" distR="0" wp14:anchorId="7A494710" wp14:editId="6EC2DCED">
+                <wp:inline distT="0" distB="0" distL="0" distR="0" ns5:anchorId="7A494710" ns5:editId="6EC2DCED">
                   <wp:extent cx="2566035" cy="625475"/>
                   <wp:effectExtent l="0" t="0" r="0" b="0"/>
                   <wp:docPr id="1201995589" name="Рисунок 1"/>
                   <wp:cNvGraphicFramePr>
-                    <a:graphicFrameLocks xmlns:a="http://schemas.openxmlformats.org/drawingml/2006/main" noChangeAspect="1"/>
+                    <a:graphicFrameLocks noChangeAspect="1"/>
                   </wp:cNvGraphicFramePr>
-                  <a:graphic xmlns:a="http://schemas.openxmlformats.org/drawingml/2006/main">
+                  <a:graphic>
                     <a:graphicData uri="http://schemas.openxmlformats.org/drawingml/2006/picture">
-                      <pic:pic xmlns:pic="http://schemas.openxmlformats.org/drawingml/2006/picture">
+                      <pic:pic>
                         <pic:nvPicPr>
                           <pic:cNvPr id="1201995589" name="Рисунок 1201995589"/>
                           <pic:cNvPicPr/>
@@ -477,7 +477,7 @@
                           <a:blip r:embed="rId11" cstate="print">
                             <a:extLst>
                               <a:ext uri="{28A0092B-C50C-407E-A947-70E740481C1C}">
-                                <a14:useLocalDpi xmlns:a14="http://schemas.microsoft.com/office/drawing/2010/main" val="0"/>
+                                <ns8:useLocalDpi val="0"/>
                               </a:ext>
                             </a:extLst>
                           </a:blip>
@@ -6046,16 +6046,16 @@
           <w:szCs w:val="20"/>
         </w:rPr>
         <w:drawing>
-          <wp:inline distT="0" distB="0" distL="0" distR="0" wp14:anchorId="00F203B4" wp14:editId="5F84C67D">
+          <wp:inline distT="0" distB="0" distL="0" distR="0" ns5:anchorId="00F203B4" ns5:editId="5F84C67D">
             <wp:extent cx="2475997" cy="1158413"/>
             <wp:effectExtent l="0" t="0" r="635" b="0"/>
             <wp:docPr id="2" name="Obraz 2"/>
             <wp:cNvGraphicFramePr>
-              <a:graphicFrameLocks xmlns:a="http://schemas.openxmlformats.org/drawingml/2006/main" noChangeAspect="1"/>
+              <a:graphicFrameLocks noChangeAspect="1"/>
             </wp:cNvGraphicFramePr>
-            <a:graphic xmlns:a="http://schemas.openxmlformats.org/drawingml/2006/main">
+            <a:graphic>
               <a:graphicData uri="http://schemas.openxmlformats.org/drawingml/2006/picture">
-                <pic:pic xmlns:pic="http://schemas.openxmlformats.org/drawingml/2006/picture">
+                <pic:pic>
                   <pic:nvPicPr>
                     <pic:cNvPr id="1" name=""/>
                     <pic:cNvPicPr/>
@@ -6090,16 +6090,16 @@
           <w:szCs w:val="20"/>
         </w:rPr>
         <w:drawing>
-          <wp:inline distT="0" distB="0" distL="0" distR="0" wp14:anchorId="03BF88CD" wp14:editId="65EFC1D0">
+          <wp:inline distT="0" distB="0" distL="0" distR="0" ns5:anchorId="03BF88CD" ns5:editId="65EFC1D0">
             <wp:extent cx="3185620" cy="1585332"/>
             <wp:effectExtent l="0" t="0" r="2540" b="2540"/>
             <wp:docPr id="1" name="Obraz 1"/>
             <wp:cNvGraphicFramePr>
-              <a:graphicFrameLocks xmlns:a="http://schemas.openxmlformats.org/drawingml/2006/main" noChangeAspect="1"/>
+              <a:graphicFrameLocks noChangeAspect="1"/>
             </wp:cNvGraphicFramePr>
-            <a:graphic xmlns:a="http://schemas.openxmlformats.org/drawingml/2006/main">
+            <a:graphic>
               <a:graphicData uri="http://schemas.openxmlformats.org/drawingml/2006/picture">
-                <pic:pic xmlns:pic="http://schemas.openxmlformats.org/drawingml/2006/picture">
+                <pic:pic>
                   <pic:nvPicPr>
                     <pic:cNvPr id="1" name=""/>
                     <pic:cNvPicPr/>
@@ -6127,19 +6127,7 @@
       </w:r>
     </w:p>
     <w:p>
-      <w:pPr>
-        <w:rPr>
-          <w:rFonts w:ascii="Calibri" w:hAnsi="Calibri"/>
-          <w:sz w:val="22"/>
-          <w:szCs w:val="22"/>
-        </w:rPr>
-      </w:pPr>
       <w:r>
-        <w:rPr>
-          <w:rFonts w:ascii="Calibri" w:hAnsi="Calibri"/>
-          <w:sz w:val="22"/>
-          <w:szCs w:val="22"/>
-        </w:rPr>
         <w:br w:type="page"/>
       </w:r>
     </w:p>
@@ -15211,58 +15199,6 @@
         </w:p>
       </w:sdtContent>
     </w:sdt>
-    <w:p>
-      <w:pPr>
-        <w:widowControl w:val="0"/>
-        <w:autoSpaceDE w:val="0"/>
-        <w:autoSpaceDN w:val="0"/>
-        <w:adjustRightInd w:val="0"/>
-        <w:jc w:val="both"/>
-        <w:rPr>
-          <w:color w:val="000000"/>
-          <w:sz w:val="22"/>
-        </w:rPr>
-      </w:pPr>
-    </w:p>
-    <w:p>
-      <w:pPr>
-        <w:widowControl w:val="0"/>
-        <w:autoSpaceDE w:val="0"/>
-        <w:autoSpaceDN w:val="0"/>
-        <w:adjustRightInd w:val="0"/>
-        <w:jc w:val="both"/>
-        <w:rPr>
-          <w:color w:val="000000"/>
-          <w:sz w:val="22"/>
-        </w:rPr>
-      </w:pPr>
-    </w:p>
-    <w:p>
-      <w:pPr>
-        <w:widowControl w:val="0"/>
-        <w:autoSpaceDE w:val="0"/>
-        <w:autoSpaceDN w:val="0"/>
-        <w:adjustRightInd w:val="0"/>
-        <w:jc w:val="both"/>
-        <w:rPr>
-          <w:color w:val="000000"/>
-          <w:sz w:val="22"/>
-        </w:rPr>
-      </w:pPr>
-    </w:p>
-    <w:p>
-      <w:pPr>
-        <w:widowControl w:val="0"/>
-        <w:autoSpaceDE w:val="0"/>
-        <w:autoSpaceDN w:val="0"/>
-        <w:adjustRightInd w:val="0"/>
-        <w:jc w:val="both"/>
-        <w:rPr>
-          <w:color w:val="000000"/>
-          <w:sz w:val="22"/>
-        </w:rPr>
-      </w:pPr>
-    </w:p>
     <w:p>
       <w:pPr>
         <w:widowControl w:val="0"/>

</xml_diff>

<commit_message>
Refine sale contract Word layout
</commit_message>
<xml_diff>
--- a/contract-pdf-work/templates/Umowa_Sprzedazy_AG_template.docx
+++ b/contract-pdf-work/templates/Umowa_Sprzedazy_AG_template.docx
@@ -1461,6 +1461,7 @@
               <w:bottom w:val="single" w:sz="4" w:space="0" w:color="auto"/>
             </w:tcBorders>
             <w:shd w:val="clear" w:color="auto" w:fill="FFFFFF" w:themeFill="background1"/>
+            <w:vAlign w:val="center"/>
           </w:tcPr>
           <w:sdt>
             <w:sdtPr>
@@ -1485,6 +1486,7 @@
                     <w:sz w:val="36"/>
                     <w:szCs w:val="36"/>
                   </w:rPr>
+                  <w:jc w:val="center"/>
                 </w:pPr>
                 <w:r>
                   <w:rPr>
@@ -12589,8 +12591,8 @@
           <w:b/>
           <w:bCs/>
           <w:color w:val="000000"/>
-          <w:sz w:val="18"/>
-          <w:szCs w:val="18"/>
+          <w:sz w:val="16"/>
+          <w:szCs w:val="16"/>
         </w:rPr>
       </w:pPr>
       <w:bookmarkStart w:id="2" w:name="OLE_LINK4"/>
@@ -12599,8 +12601,8 @@
           <w:b/>
           <w:bCs/>
           <w:color w:val="000000"/>
-          <w:sz w:val="18"/>
-          <w:szCs w:val="18"/>
+          <w:sz w:val="16"/>
+          <w:szCs w:val="16"/>
         </w:rPr>
         <w:t xml:space="preserve">Kupujący powinien </w:t>
       </w:r>
@@ -12609,8 +12611,8 @@
           <w:b/>
           <w:bCs/>
           <w:color w:val="000000"/>
-          <w:sz w:val="18"/>
-          <w:szCs w:val="18"/>
+          <w:sz w:val="16"/>
+          <w:szCs w:val="16"/>
         </w:rPr>
         <w:t xml:space="preserve">niezwłocznie po zakupie sprawdzić </w:t>
       </w:r>
@@ -12619,8 +12621,8 @@
           <w:b/>
           <w:bCs/>
           <w:color w:val="000000"/>
-          <w:sz w:val="18"/>
-          <w:szCs w:val="18"/>
+          <w:sz w:val="16"/>
+          <w:szCs w:val="16"/>
         </w:rPr>
         <w:t xml:space="preserve">poziom płynów </w:t>
       </w:r>
@@ -12629,8 +12631,8 @@
           <w:b/>
           <w:bCs/>
           <w:color w:val="000000"/>
-          <w:sz w:val="18"/>
-          <w:szCs w:val="18"/>
+          <w:sz w:val="16"/>
+          <w:szCs w:val="16"/>
         </w:rPr>
         <w:t>i</w:t>
       </w:r>
@@ -12639,8 +12641,8 @@
           <w:b/>
           <w:bCs/>
           <w:color w:val="000000"/>
-          <w:sz w:val="18"/>
-          <w:szCs w:val="18"/>
+          <w:sz w:val="16"/>
+          <w:szCs w:val="16"/>
         </w:rPr>
         <w:t xml:space="preserve"> czy </w:t>
       </w:r>
@@ -12649,8 +12651,8 @@
           <w:b/>
           <w:bCs/>
           <w:color w:val="000000"/>
-          <w:sz w:val="18"/>
-          <w:szCs w:val="18"/>
+          <w:sz w:val="16"/>
+          <w:szCs w:val="16"/>
         </w:rPr>
         <w:t>olej i filtry</w:t>
       </w:r>
@@ -12659,8 +12661,8 @@
           <w:b/>
           <w:bCs/>
           <w:color w:val="000000"/>
-          <w:sz w:val="18"/>
-          <w:szCs w:val="18"/>
+          <w:sz w:val="16"/>
+          <w:szCs w:val="16"/>
         </w:rPr>
         <w:t xml:space="preserve"> wymagają wymiany</w:t>
       </w:r>
@@ -12669,8 +12671,8 @@
           <w:b/>
           <w:bCs/>
           <w:color w:val="000000"/>
-          <w:sz w:val="18"/>
-          <w:szCs w:val="18"/>
+          <w:sz w:val="16"/>
+          <w:szCs w:val="16"/>
         </w:rPr>
         <w:t>.</w:t>
       </w:r>
@@ -12688,28 +12690,28 @@
         <w:ind w:left="-284"/>
         <w:jc w:val="both"/>
         <w:rPr>
-          <w:sz w:val="18"/>
-          <w:szCs w:val="18"/>
+          <w:sz w:val="16"/>
+          <w:szCs w:val="16"/>
         </w:rPr>
       </w:pPr>
       <w:r>
         <w:rPr>
-          <w:sz w:val="18"/>
-          <w:szCs w:val="18"/>
+          <w:sz w:val="16"/>
+          <w:szCs w:val="16"/>
         </w:rPr>
         <w:t xml:space="preserve">Dodatkowe </w:t>
       </w:r>
       <w:r>
         <w:rPr>
-          <w:sz w:val="18"/>
-          <w:szCs w:val="18"/>
+          <w:sz w:val="16"/>
+          <w:szCs w:val="16"/>
         </w:rPr>
         <w:t xml:space="preserve">informacje i </w:t>
       </w:r>
       <w:r>
         <w:rPr>
-          <w:sz w:val="18"/>
-          <w:szCs w:val="18"/>
+          <w:sz w:val="16"/>
+          <w:szCs w:val="16"/>
         </w:rPr>
         <w:t>postanowienia umowne:</w:t>
       </w:r>
@@ -12727,16 +12729,16 @@
         <w:ind w:left="142" w:right="-6" w:hanging="218"/>
         <w:jc w:val="both"/>
         <w:rPr>
-          <w:sz w:val="18"/>
-          <w:szCs w:val="18"/>
+          <w:sz w:val="16"/>
+          <w:szCs w:val="16"/>
         </w:rPr>
       </w:pPr>
       <w:r>
         <w:rPr>
           <w:b/>
           <w:bCs/>
-          <w:sz w:val="18"/>
-          <w:szCs w:val="18"/>
+          <w:sz w:val="16"/>
+          <w:szCs w:val="16"/>
         </w:rPr>
         <w:t xml:space="preserve">Jeśli do Pojazdu wykupiono zabezpieczenie gwarancyjne lub ma on gwarancję Kupujący </w:t>
       </w:r>
@@ -12744,8 +12746,8 @@
         <w:rPr>
           <w:b/>
           <w:bCs/>
-          <w:sz w:val="18"/>
-          <w:szCs w:val="18"/>
+          <w:sz w:val="16"/>
+          <w:szCs w:val="16"/>
         </w:rPr>
         <w:t>może</w:t>
       </w:r>
@@ -12753,8 +12755,8 @@
         <w:rPr>
           <w:b/>
           <w:bCs/>
-          <w:sz w:val="18"/>
-          <w:szCs w:val="18"/>
+          <w:sz w:val="16"/>
+          <w:szCs w:val="16"/>
         </w:rPr>
         <w:t xml:space="preserve"> </w:t>
       </w:r>
@@ -12762,8 +12764,8 @@
         <w:rPr>
           <w:b/>
           <w:bCs/>
-          <w:sz w:val="18"/>
-          <w:szCs w:val="18"/>
+          <w:sz w:val="16"/>
+          <w:szCs w:val="16"/>
         </w:rPr>
         <w:t xml:space="preserve">zgłosić </w:t>
       </w:r>
@@ -12771,99 +12773,99 @@
         <w:rPr>
           <w:b/>
           <w:bCs/>
-          <w:sz w:val="18"/>
-          <w:szCs w:val="18"/>
+          <w:sz w:val="16"/>
+          <w:szCs w:val="16"/>
         </w:rPr>
         <w:t xml:space="preserve">roszczenia z tych uprawnień bezpośrednio do gwaranta. </w:t>
       </w:r>
       <w:r>
         <w:rPr>
-          <w:sz w:val="18"/>
-          <w:szCs w:val="18"/>
+          <w:sz w:val="16"/>
+          <w:szCs w:val="16"/>
         </w:rPr>
         <w:t xml:space="preserve">Szczegółowe informacje o gwarancji zawiera oświadczenie gwarancyjne. </w:t>
       </w:r>
       <w:r>
         <w:rPr>
-          <w:sz w:val="18"/>
-          <w:szCs w:val="18"/>
+          <w:sz w:val="16"/>
+          <w:szCs w:val="16"/>
         </w:rPr>
         <w:t xml:space="preserve">Gwarancja nie ma wpływu na te środki ochrony prawnej które ze strony i na koszt sprzedawcy w razie braku zgodności rzeczy sprzedanej z umową przysługują kupującemu z mocy prawa.  </w:t>
       </w:r>
       <w:r>
         <w:rPr>
-          <w:sz w:val="18"/>
-          <w:szCs w:val="18"/>
+          <w:sz w:val="16"/>
+          <w:szCs w:val="16"/>
         </w:rPr>
         <w:t>Sprzedawca nie jest producentem</w:t>
       </w:r>
       <w:r>
         <w:rPr>
-          <w:sz w:val="18"/>
-          <w:szCs w:val="18"/>
+          <w:sz w:val="16"/>
+          <w:szCs w:val="16"/>
         </w:rPr>
         <w:t>,</w:t>
       </w:r>
       <w:r>
         <w:rPr>
-          <w:sz w:val="18"/>
-          <w:szCs w:val="18"/>
+          <w:sz w:val="16"/>
+          <w:szCs w:val="16"/>
         </w:rPr>
         <w:t xml:space="preserve"> nie</w:t>
       </w:r>
       <w:r>
         <w:rPr>
-          <w:sz w:val="18"/>
-          <w:szCs w:val="18"/>
+          <w:sz w:val="16"/>
+          <w:szCs w:val="16"/>
         </w:rPr>
         <w:t> </w:t>
       </w:r>
       <w:r>
         <w:rPr>
-          <w:sz w:val="18"/>
-          <w:szCs w:val="18"/>
+          <w:sz w:val="16"/>
+          <w:szCs w:val="16"/>
         </w:rPr>
         <w:t xml:space="preserve">gwarantuje, że </w:t>
       </w:r>
       <w:r>
         <w:rPr>
-          <w:sz w:val="18"/>
-          <w:szCs w:val="18"/>
+          <w:sz w:val="16"/>
+          <w:szCs w:val="16"/>
         </w:rPr>
         <w:t>p</w:t>
       </w:r>
       <w:r>
         <w:rPr>
-          <w:sz w:val="18"/>
-          <w:szCs w:val="18"/>
+          <w:sz w:val="16"/>
+          <w:szCs w:val="16"/>
         </w:rPr>
         <w:t xml:space="preserve">ojazd </w:t>
       </w:r>
       <w:r>
         <w:rPr>
-          <w:sz w:val="18"/>
-          <w:szCs w:val="18"/>
+          <w:sz w:val="16"/>
+          <w:szCs w:val="16"/>
         </w:rPr>
         <w:t xml:space="preserve">używany </w:t>
       </w:r>
       <w:r>
         <w:rPr>
-          <w:sz w:val="18"/>
-          <w:szCs w:val="18"/>
+          <w:sz w:val="16"/>
+          <w:szCs w:val="16"/>
         </w:rPr>
         <w:t>posiada ważną gwarancję</w:t>
       </w:r>
       <w:r>
         <w:rPr>
-          <w:sz w:val="18"/>
-          <w:szCs w:val="18"/>
+          <w:sz w:val="16"/>
+          <w:szCs w:val="16"/>
         </w:rPr>
         <w:t xml:space="preserve"> producenta</w:t>
       </w:r>
       <w:r>
         <w:rPr>
-          <w:sz w:val="18"/>
-          <w:szCs w:val="18"/>
+          <w:sz w:val="16"/>
+          <w:szCs w:val="16"/>
         </w:rPr>
         <w:t>.</w:t>
       </w:r>
@@ -12881,161 +12883,161 @@
         <w:ind w:left="142" w:right="-6" w:hanging="218"/>
         <w:jc w:val="both"/>
         <w:rPr>
-          <w:sz w:val="18"/>
-          <w:szCs w:val="18"/>
+          <w:sz w:val="16"/>
+          <w:szCs w:val="16"/>
         </w:rPr>
       </w:pPr>
       <w:r>
         <w:rPr>
-          <w:sz w:val="18"/>
-          <w:szCs w:val="18"/>
+          <w:sz w:val="16"/>
+          <w:szCs w:val="16"/>
         </w:rPr>
         <w:t xml:space="preserve">Sprzedawca </w:t>
       </w:r>
       <w:r>
         <w:rPr>
-          <w:sz w:val="18"/>
-          <w:szCs w:val="18"/>
+          <w:sz w:val="16"/>
+          <w:szCs w:val="16"/>
         </w:rPr>
         <w:t>oświadcza</w:t>
       </w:r>
       <w:r>
         <w:rPr>
-          <w:sz w:val="18"/>
-          <w:szCs w:val="18"/>
+          <w:sz w:val="16"/>
+          <w:szCs w:val="16"/>
         </w:rPr>
         <w:t xml:space="preserve">, że </w:t>
       </w:r>
       <w:r>
         <w:rPr>
-          <w:sz w:val="18"/>
-          <w:szCs w:val="18"/>
+          <w:sz w:val="16"/>
+          <w:szCs w:val="16"/>
         </w:rPr>
         <w:t xml:space="preserve">podejmie się i </w:t>
       </w:r>
       <w:r>
         <w:rPr>
-          <w:sz w:val="18"/>
-          <w:szCs w:val="18"/>
+          <w:sz w:val="16"/>
+          <w:szCs w:val="16"/>
         </w:rPr>
         <w:t>usuni</w:t>
       </w:r>
       <w:r>
         <w:rPr>
-          <w:sz w:val="18"/>
-          <w:szCs w:val="18"/>
+          <w:sz w:val="16"/>
+          <w:szCs w:val="16"/>
         </w:rPr>
         <w:t>e</w:t>
       </w:r>
       <w:r>
         <w:rPr>
-          <w:sz w:val="18"/>
-          <w:szCs w:val="18"/>
+          <w:sz w:val="16"/>
+          <w:szCs w:val="16"/>
         </w:rPr>
         <w:t xml:space="preserve"> niezgodności z umową w rozsądnym czasie</w:t>
       </w:r>
       <w:r>
         <w:rPr>
-          <w:sz w:val="18"/>
-          <w:szCs w:val="18"/>
+          <w:sz w:val="16"/>
+          <w:szCs w:val="16"/>
         </w:rPr>
         <w:t>.</w:t>
       </w:r>
       <w:r>
         <w:rPr>
-          <w:sz w:val="18"/>
-          <w:szCs w:val="18"/>
+          <w:sz w:val="16"/>
+          <w:szCs w:val="16"/>
         </w:rPr>
         <w:t xml:space="preserve"> Do usunięcia </w:t>
       </w:r>
       <w:r>
         <w:rPr>
-          <w:sz w:val="18"/>
-          <w:szCs w:val="18"/>
+          <w:sz w:val="16"/>
+          <w:szCs w:val="16"/>
         </w:rPr>
         <w:t>niezgodności</w:t>
       </w:r>
       <w:r>
         <w:rPr>
-          <w:sz w:val="18"/>
-          <w:szCs w:val="18"/>
+          <w:sz w:val="16"/>
+          <w:szCs w:val="16"/>
         </w:rPr>
         <w:t xml:space="preserve"> niezbędny </w:t>
       </w:r>
       <w:r>
         <w:rPr>
-          <w:sz w:val="18"/>
-          <w:szCs w:val="18"/>
+          <w:sz w:val="16"/>
+          <w:szCs w:val="16"/>
         </w:rPr>
         <w:t>może być</w:t>
       </w:r>
       <w:r>
         <w:rPr>
-          <w:sz w:val="18"/>
-          <w:szCs w:val="18"/>
+          <w:sz w:val="16"/>
+          <w:szCs w:val="16"/>
         </w:rPr>
         <w:t xml:space="preserve"> dostęp do Pojazdu. </w:t>
       </w:r>
       <w:r>
         <w:rPr>
-          <w:sz w:val="18"/>
-          <w:szCs w:val="18"/>
+          <w:sz w:val="16"/>
+          <w:szCs w:val="16"/>
         </w:rPr>
         <w:t xml:space="preserve">Przy reklamacji </w:t>
       </w:r>
       <w:r>
         <w:rPr>
-          <w:sz w:val="18"/>
-          <w:szCs w:val="18"/>
+          <w:sz w:val="16"/>
+          <w:szCs w:val="16"/>
         </w:rPr>
         <w:t>sprzedawca zbada</w:t>
       </w:r>
       <w:r>
         <w:rPr>
-          <w:sz w:val="18"/>
-          <w:szCs w:val="18"/>
+          <w:sz w:val="16"/>
+          <w:szCs w:val="16"/>
         </w:rPr>
         <w:t xml:space="preserve"> dowody na powoływane twierdzenia. </w:t>
       </w:r>
       <w:r>
         <w:rPr>
-          <w:sz w:val="18"/>
-          <w:szCs w:val="18"/>
+          <w:sz w:val="16"/>
+          <w:szCs w:val="16"/>
         </w:rPr>
         <w:t>Samodzielne naprawy</w:t>
       </w:r>
       <w:r>
         <w:rPr>
-          <w:sz w:val="18"/>
-          <w:szCs w:val="18"/>
+          <w:sz w:val="16"/>
+          <w:szCs w:val="16"/>
         </w:rPr>
         <w:t xml:space="preserve"> </w:t>
       </w:r>
       <w:r>
         <w:rPr>
-          <w:sz w:val="18"/>
-          <w:szCs w:val="18"/>
+          <w:sz w:val="16"/>
+          <w:szCs w:val="16"/>
         </w:rPr>
         <w:t xml:space="preserve">wad </w:t>
       </w:r>
       <w:r>
         <w:rPr>
-          <w:sz w:val="18"/>
-          <w:szCs w:val="18"/>
+          <w:sz w:val="16"/>
+          <w:szCs w:val="16"/>
         </w:rPr>
         <w:t>następują na ryzyko właściciela</w:t>
       </w:r>
       <w:r>
         <w:rPr>
-          <w:sz w:val="18"/>
-          <w:szCs w:val="18"/>
+          <w:sz w:val="16"/>
+          <w:szCs w:val="16"/>
         </w:rPr>
         <w:t>,</w:t>
       </w:r>
       <w:r>
         <w:rPr>
-          <w:sz w:val="18"/>
-          <w:szCs w:val="18"/>
+          <w:sz w:val="16"/>
+          <w:szCs w:val="16"/>
         </w:rPr>
         <w:t xml:space="preserve"> mogą skutkować nieuwzględnieniem reklamacji.</w:t>
       </w:r>
@@ -13053,28 +13055,28 @@
         <w:ind w:left="142" w:right="-6" w:hanging="218"/>
         <w:jc w:val="both"/>
         <w:rPr>
-          <w:sz w:val="18"/>
-          <w:szCs w:val="18"/>
+          <w:sz w:val="16"/>
+          <w:szCs w:val="16"/>
         </w:rPr>
       </w:pPr>
       <w:r>
         <w:rPr>
-          <w:sz w:val="18"/>
-          <w:szCs w:val="18"/>
+          <w:sz w:val="16"/>
+          <w:szCs w:val="16"/>
         </w:rPr>
         <w:t xml:space="preserve">W przypadku kupujących - przedsiębiorców wpisanych do KRS i przedsiębiorców - osób fizycznych zawierających umowę o charakterze zawodowym wszelkie spory rozstrzyga </w:t>
       </w:r>
       <w:r>
         <w:rPr>
-          <w:sz w:val="18"/>
-          <w:szCs w:val="18"/>
+          <w:sz w:val="16"/>
+          <w:szCs w:val="16"/>
         </w:rPr>
         <w:t xml:space="preserve">tylko </w:t>
       </w:r>
       <w:r>
         <w:rPr>
-          <w:sz w:val="18"/>
-          <w:szCs w:val="18"/>
+          <w:sz w:val="16"/>
+          <w:szCs w:val="16"/>
         </w:rPr>
         <w:t>sąd właściwy miejscowo dla siedziby Sprzedawcy, z wyłączeniem dowodów z ogłoszeń sprzedaży Pojazdu (umowa dowodowa i o właściwość miejscową).</w:t>
       </w:r>
@@ -13092,149 +13094,149 @@
         <w:ind w:left="142" w:right="-6" w:hanging="218"/>
         <w:jc w:val="both"/>
         <w:rPr>
-          <w:sz w:val="18"/>
-          <w:szCs w:val="18"/>
+          <w:sz w:val="16"/>
+          <w:szCs w:val="16"/>
         </w:rPr>
       </w:pPr>
       <w:r>
         <w:rPr>
-          <w:sz w:val="18"/>
-          <w:szCs w:val="18"/>
+          <w:sz w:val="16"/>
+          <w:szCs w:val="16"/>
         </w:rPr>
         <w:t xml:space="preserve">Sprzedawca informuje, że sprzedaje rzecz używaną, dlatego </w:t>
       </w:r>
       <w:r>
         <w:rPr>
-          <w:sz w:val="18"/>
-          <w:szCs w:val="18"/>
+          <w:sz w:val="16"/>
+          <w:szCs w:val="16"/>
         </w:rPr>
         <w:t xml:space="preserve">odpowiedzialność </w:t>
       </w:r>
       <w:r>
         <w:rPr>
-          <w:sz w:val="18"/>
-          <w:szCs w:val="18"/>
+          <w:sz w:val="16"/>
+          <w:szCs w:val="16"/>
         </w:rPr>
         <w:t>z tytułu</w:t>
       </w:r>
       <w:r>
         <w:rPr>
-          <w:sz w:val="18"/>
-          <w:szCs w:val="18"/>
+          <w:sz w:val="16"/>
+          <w:szCs w:val="16"/>
         </w:rPr>
         <w:t xml:space="preserve"> </w:t>
       </w:r>
       <w:r>
         <w:rPr>
-          <w:sz w:val="18"/>
-          <w:szCs w:val="18"/>
+          <w:sz w:val="16"/>
+          <w:szCs w:val="16"/>
         </w:rPr>
         <w:t>nie</w:t>
       </w:r>
       <w:r>
         <w:rPr>
-          <w:sz w:val="18"/>
-          <w:szCs w:val="18"/>
+          <w:sz w:val="16"/>
+          <w:szCs w:val="16"/>
         </w:rPr>
         <w:t>zgodnoś</w:t>
       </w:r>
       <w:r>
         <w:rPr>
-          <w:sz w:val="18"/>
-          <w:szCs w:val="18"/>
+          <w:sz w:val="16"/>
+          <w:szCs w:val="16"/>
         </w:rPr>
         <w:t>ci towaru</w:t>
       </w:r>
       <w:r>
         <w:rPr>
-          <w:sz w:val="18"/>
-          <w:szCs w:val="18"/>
+          <w:sz w:val="16"/>
+          <w:szCs w:val="16"/>
         </w:rPr>
         <w:t xml:space="preserve"> z umową jest </w:t>
       </w:r>
       <w:proofErr w:type="gramStart"/>
       <w:r>
         <w:rPr>
-          <w:sz w:val="18"/>
-          <w:szCs w:val="18"/>
+          <w:sz w:val="16"/>
+          <w:szCs w:val="16"/>
         </w:rPr>
         <w:t>wyłączona</w:t>
       </w:r>
       <w:proofErr w:type="gramEnd"/>
       <w:r>
         <w:rPr>
-          <w:sz w:val="18"/>
-          <w:szCs w:val="18"/>
+          <w:sz w:val="16"/>
+          <w:szCs w:val="16"/>
         </w:rPr>
         <w:t xml:space="preserve"> </w:t>
       </w:r>
       <w:r>
         <w:rPr>
-          <w:sz w:val="18"/>
-          <w:szCs w:val="18"/>
+          <w:sz w:val="16"/>
+          <w:szCs w:val="16"/>
         </w:rPr>
         <w:t xml:space="preserve">jeśli kupujący </w:t>
       </w:r>
       <w:r>
         <w:rPr>
-          <w:sz w:val="18"/>
-          <w:szCs w:val="18"/>
+          <w:sz w:val="16"/>
+          <w:szCs w:val="16"/>
         </w:rPr>
         <w:t xml:space="preserve">nie </w:t>
       </w:r>
       <w:r>
         <w:rPr>
-          <w:sz w:val="18"/>
-          <w:szCs w:val="18"/>
+          <w:sz w:val="16"/>
+          <w:szCs w:val="16"/>
         </w:rPr>
         <w:t xml:space="preserve">jest </w:t>
       </w:r>
       <w:r>
         <w:rPr>
-          <w:sz w:val="18"/>
-          <w:szCs w:val="18"/>
+          <w:sz w:val="16"/>
+          <w:szCs w:val="16"/>
         </w:rPr>
         <w:t>konsumentem</w:t>
       </w:r>
       <w:r>
         <w:rPr>
-          <w:sz w:val="18"/>
-          <w:szCs w:val="18"/>
+          <w:sz w:val="16"/>
+          <w:szCs w:val="16"/>
         </w:rPr>
         <w:t>. Sprzedawca informuje, że zuż</w:t>
       </w:r>
       <w:r>
         <w:rPr>
-          <w:sz w:val="18"/>
-          <w:szCs w:val="18"/>
+          <w:sz w:val="16"/>
+          <w:szCs w:val="16"/>
         </w:rPr>
         <w:t>ywanie</w:t>
       </w:r>
       <w:r>
         <w:rPr>
-          <w:sz w:val="18"/>
-          <w:szCs w:val="18"/>
+          <w:sz w:val="16"/>
+          <w:szCs w:val="16"/>
         </w:rPr>
         <w:t xml:space="preserve"> </w:t>
       </w:r>
       <w:r>
         <w:rPr>
-          <w:sz w:val="18"/>
-          <w:szCs w:val="18"/>
+          <w:sz w:val="16"/>
+          <w:szCs w:val="16"/>
         </w:rPr>
         <w:t xml:space="preserve">spowoduje konieczność nakładów </w:t>
       </w:r>
       <w:r>
         <w:rPr>
-          <w:sz w:val="18"/>
-          <w:szCs w:val="18"/>
+          <w:sz w:val="16"/>
+          <w:szCs w:val="16"/>
         </w:rPr>
         <w:t>na utrzymanie pojazdu</w:t>
       </w:r>
       <w:r>
         <w:rPr>
-          <w:sz w:val="18"/>
-          <w:szCs w:val="18"/>
+          <w:sz w:val="16"/>
+          <w:szCs w:val="16"/>
         </w:rPr>
         <w:t xml:space="preserve">. </w:t>
       </w:r>
@@ -13252,140 +13254,140 @@
         <w:ind w:left="142" w:right="-6" w:hanging="218"/>
         <w:jc w:val="both"/>
         <w:rPr>
-          <w:sz w:val="18"/>
-          <w:szCs w:val="18"/>
+          <w:sz w:val="16"/>
+          <w:szCs w:val="16"/>
         </w:rPr>
       </w:pPr>
       <w:r>
         <w:rPr>
-          <w:sz w:val="18"/>
-          <w:szCs w:val="18"/>
+          <w:sz w:val="16"/>
+          <w:szCs w:val="16"/>
         </w:rPr>
         <w:t xml:space="preserve">Sprzedawca </w:t>
       </w:r>
       <w:r>
         <w:rPr>
-          <w:sz w:val="18"/>
-          <w:szCs w:val="18"/>
+          <w:sz w:val="16"/>
+          <w:szCs w:val="16"/>
         </w:rPr>
         <w:t>ustal</w:t>
       </w:r>
       <w:r>
         <w:rPr>
-          <w:sz w:val="18"/>
-          <w:szCs w:val="18"/>
+          <w:sz w:val="16"/>
+          <w:szCs w:val="16"/>
         </w:rPr>
         <w:t>a cenę</w:t>
       </w:r>
       <w:r>
         <w:rPr>
-          <w:sz w:val="18"/>
-          <w:szCs w:val="18"/>
+          <w:sz w:val="16"/>
+          <w:szCs w:val="16"/>
         </w:rPr>
         <w:t xml:space="preserve"> w drodze negocjacji, uwzględniając stan techniczny i wyposażenie Pojazdu opisane w niniejszym dokumencie i </w:t>
       </w:r>
       <w:r>
         <w:rPr>
-          <w:sz w:val="18"/>
-          <w:szCs w:val="18"/>
+          <w:sz w:val="16"/>
+          <w:szCs w:val="16"/>
         </w:rPr>
         <w:t xml:space="preserve">jezdność </w:t>
       </w:r>
       <w:r>
         <w:rPr>
-          <w:sz w:val="18"/>
-          <w:szCs w:val="18"/>
+          <w:sz w:val="16"/>
+          <w:szCs w:val="16"/>
         </w:rPr>
         <w:t xml:space="preserve">w momencie sprzedaży. </w:t>
       </w:r>
       <w:r>
         <w:rPr>
-          <w:sz w:val="18"/>
-          <w:szCs w:val="18"/>
+          <w:sz w:val="16"/>
+          <w:szCs w:val="16"/>
         </w:rPr>
         <w:t>Udzielenie rabatu z określonego powodu oznacza, że kupujący i Sprzedawca ustalili cenę sprzedaży uwzględniając stan techniczny Pojazdu jak też konieczność diagnozy i podjęcia czynności serwisowych we własnym zakresie przez kupującego.</w:t>
       </w:r>
       <w:r>
         <w:rPr>
-          <w:sz w:val="18"/>
-          <w:szCs w:val="18"/>
+          <w:sz w:val="16"/>
+          <w:szCs w:val="16"/>
         </w:rPr>
         <w:t xml:space="preserve"> Pojazd </w:t>
       </w:r>
       <w:r>
         <w:rPr>
-          <w:sz w:val="18"/>
-          <w:szCs w:val="18"/>
+          <w:sz w:val="16"/>
+          <w:szCs w:val="16"/>
         </w:rPr>
         <w:t xml:space="preserve">może </w:t>
       </w:r>
       <w:r>
         <w:rPr>
-          <w:sz w:val="18"/>
-          <w:szCs w:val="18"/>
+          <w:sz w:val="16"/>
+          <w:szCs w:val="16"/>
         </w:rPr>
         <w:t>podlega</w:t>
       </w:r>
       <w:r>
         <w:rPr>
-          <w:sz w:val="18"/>
-          <w:szCs w:val="18"/>
+          <w:sz w:val="16"/>
+          <w:szCs w:val="16"/>
         </w:rPr>
         <w:t xml:space="preserve">ć </w:t>
       </w:r>
       <w:r>
         <w:rPr>
-          <w:sz w:val="18"/>
-          <w:szCs w:val="18"/>
+          <w:sz w:val="16"/>
+          <w:szCs w:val="16"/>
         </w:rPr>
         <w:t xml:space="preserve">ograniczeniom wjazdu </w:t>
       </w:r>
       <w:r>
         <w:rPr>
-          <w:sz w:val="18"/>
-          <w:szCs w:val="18"/>
+          <w:sz w:val="16"/>
+          <w:szCs w:val="16"/>
         </w:rPr>
         <w:t xml:space="preserve">do </w:t>
       </w:r>
       <w:r>
         <w:rPr>
-          <w:sz w:val="18"/>
-          <w:szCs w:val="18"/>
+          <w:sz w:val="16"/>
+          <w:szCs w:val="16"/>
         </w:rPr>
         <w:t>stref czystego transportu</w:t>
       </w:r>
       <w:r>
         <w:rPr>
-          <w:sz w:val="18"/>
-          <w:szCs w:val="18"/>
+          <w:sz w:val="16"/>
+          <w:szCs w:val="16"/>
         </w:rPr>
         <w:t>,</w:t>
       </w:r>
       <w:r>
         <w:rPr>
-          <w:sz w:val="18"/>
-          <w:szCs w:val="18"/>
+          <w:sz w:val="16"/>
+          <w:szCs w:val="16"/>
         </w:rPr>
         <w:t xml:space="preserve"> zależnie od </w:t>
       </w:r>
       <w:r>
         <w:rPr>
-          <w:sz w:val="18"/>
-          <w:szCs w:val="18"/>
+          <w:sz w:val="16"/>
+          <w:szCs w:val="16"/>
         </w:rPr>
         <w:t xml:space="preserve">wieku i </w:t>
       </w:r>
       <w:r>
         <w:rPr>
-          <w:sz w:val="18"/>
-          <w:szCs w:val="18"/>
+          <w:sz w:val="16"/>
+          <w:szCs w:val="16"/>
         </w:rPr>
         <w:t>norm emisji spalin</w:t>
       </w:r>
       <w:r>
         <w:rPr>
-          <w:sz w:val="18"/>
-          <w:szCs w:val="18"/>
+          <w:sz w:val="16"/>
+          <w:szCs w:val="16"/>
         </w:rPr>
         <w:t>.</w:t>
       </w:r>
@@ -13403,182 +13405,182 @@
         <w:ind w:left="142" w:right="-6" w:hanging="218"/>
         <w:jc w:val="both"/>
         <w:rPr>
-          <w:sz w:val="18"/>
-          <w:szCs w:val="18"/>
+          <w:sz w:val="16"/>
+          <w:szCs w:val="16"/>
         </w:rPr>
       </w:pPr>
       <w:r>
         <w:rPr>
-          <w:sz w:val="18"/>
-          <w:szCs w:val="18"/>
+          <w:sz w:val="16"/>
+          <w:szCs w:val="16"/>
         </w:rPr>
         <w:t>Oznaczenie o</w:t>
       </w:r>
       <w:r>
         <w:rPr>
-          <w:sz w:val="18"/>
-          <w:szCs w:val="18"/>
+          <w:sz w:val="16"/>
+          <w:szCs w:val="16"/>
         </w:rPr>
         <w:t xml:space="preserve">gólne zużycie „brak” oznacza bardzo dobry stan techniczny samochodu. </w:t>
       </w:r>
       <w:r>
         <w:rPr>
-          <w:sz w:val="18"/>
-          <w:szCs w:val="18"/>
+          <w:sz w:val="16"/>
+          <w:szCs w:val="16"/>
         </w:rPr>
         <w:t xml:space="preserve">Ogólne zużycie </w:t>
       </w:r>
       <w:r>
         <w:rPr>
-          <w:sz w:val="18"/>
-          <w:szCs w:val="18"/>
+          <w:sz w:val="16"/>
+          <w:szCs w:val="16"/>
         </w:rPr>
         <w:t>„</w:t>
       </w:r>
       <w:r>
         <w:rPr>
-          <w:sz w:val="18"/>
-          <w:szCs w:val="18"/>
+          <w:sz w:val="16"/>
+          <w:szCs w:val="16"/>
         </w:rPr>
         <w:t>przeciętnie</w:t>
       </w:r>
       <w:r>
         <w:rPr>
-          <w:sz w:val="18"/>
-          <w:szCs w:val="18"/>
+          <w:sz w:val="16"/>
+          <w:szCs w:val="16"/>
         </w:rPr>
         <w:t>”</w:t>
       </w:r>
       <w:r>
         <w:rPr>
-          <w:sz w:val="18"/>
-          <w:szCs w:val="18"/>
+          <w:sz w:val="16"/>
+          <w:szCs w:val="16"/>
         </w:rPr>
         <w:t xml:space="preserve"> oznacza, że </w:t>
       </w:r>
       <w:r>
         <w:rPr>
-          <w:sz w:val="18"/>
-          <w:szCs w:val="18"/>
+          <w:sz w:val="16"/>
+          <w:szCs w:val="16"/>
         </w:rPr>
         <w:t>pewne</w:t>
       </w:r>
       <w:r>
         <w:rPr>
-          <w:sz w:val="18"/>
-          <w:szCs w:val="18"/>
+          <w:sz w:val="16"/>
+          <w:szCs w:val="16"/>
         </w:rPr>
         <w:t xml:space="preserve"> podzespoły mogą być już </w:t>
       </w:r>
       <w:r>
         <w:rPr>
-          <w:sz w:val="18"/>
-          <w:szCs w:val="18"/>
+          <w:sz w:val="16"/>
+          <w:szCs w:val="16"/>
         </w:rPr>
         <w:t>wyeksploatowane</w:t>
       </w:r>
       <w:r>
         <w:rPr>
-          <w:sz w:val="18"/>
-          <w:szCs w:val="18"/>
+          <w:sz w:val="16"/>
+          <w:szCs w:val="16"/>
         </w:rPr>
         <w:t xml:space="preserve">, stosownie do wieku i przebiegu. Ogólne zużycie </w:t>
       </w:r>
       <w:r>
         <w:rPr>
-          <w:sz w:val="18"/>
-          <w:szCs w:val="18"/>
+          <w:sz w:val="16"/>
+          <w:szCs w:val="16"/>
         </w:rPr>
         <w:t>„</w:t>
       </w:r>
       <w:r>
         <w:rPr>
-          <w:sz w:val="18"/>
-          <w:szCs w:val="18"/>
+          <w:sz w:val="16"/>
+          <w:szCs w:val="16"/>
         </w:rPr>
         <w:t>skrajne</w:t>
       </w:r>
       <w:r>
         <w:rPr>
-          <w:sz w:val="18"/>
-          <w:szCs w:val="18"/>
+          <w:sz w:val="16"/>
+          <w:szCs w:val="16"/>
         </w:rPr>
         <w:t>”</w:t>
       </w:r>
       <w:r>
         <w:rPr>
-          <w:sz w:val="18"/>
-          <w:szCs w:val="18"/>
+          <w:sz w:val="16"/>
+          <w:szCs w:val="16"/>
         </w:rPr>
         <w:t xml:space="preserve"> oznacza, że </w:t>
       </w:r>
       <w:r>
         <w:rPr>
-          <w:sz w:val="18"/>
-          <w:szCs w:val="18"/>
+          <w:sz w:val="16"/>
+          <w:szCs w:val="16"/>
         </w:rPr>
         <w:t xml:space="preserve">kluczowe </w:t>
       </w:r>
       <w:r>
         <w:rPr>
-          <w:sz w:val="18"/>
-          <w:szCs w:val="18"/>
+          <w:sz w:val="16"/>
+          <w:szCs w:val="16"/>
         </w:rPr>
         <w:t>podzespoły samochodu nie gwarantują trwałości</w:t>
       </w:r>
       <w:r>
         <w:rPr>
-          <w:sz w:val="18"/>
-          <w:szCs w:val="18"/>
+          <w:sz w:val="16"/>
+          <w:szCs w:val="16"/>
         </w:rPr>
         <w:t>,</w:t>
       </w:r>
       <w:r>
         <w:rPr>
-          <w:sz w:val="18"/>
-          <w:szCs w:val="18"/>
+          <w:sz w:val="16"/>
+          <w:szCs w:val="16"/>
         </w:rPr>
         <w:t xml:space="preserve"> pojazd nie zapewnia zdolności</w:t>
       </w:r>
       <w:r>
         <w:rPr>
-          <w:sz w:val="18"/>
-          <w:szCs w:val="18"/>
+          <w:sz w:val="16"/>
+          <w:szCs w:val="16"/>
         </w:rPr>
         <w:t xml:space="preserve"> </w:t>
       </w:r>
       <w:r>
         <w:rPr>
-          <w:sz w:val="18"/>
-          <w:szCs w:val="18"/>
+          <w:sz w:val="16"/>
+          <w:szCs w:val="16"/>
         </w:rPr>
         <w:t>przemieszczania się</w:t>
       </w:r>
       <w:r>
         <w:rPr>
-          <w:sz w:val="18"/>
-          <w:szCs w:val="18"/>
+          <w:sz w:val="16"/>
+          <w:szCs w:val="16"/>
         </w:rPr>
         <w:t xml:space="preserve"> i bezpieczeństwa</w:t>
       </w:r>
       <w:r>
         <w:rPr>
-          <w:sz w:val="18"/>
-          <w:szCs w:val="18"/>
+          <w:sz w:val="16"/>
+          <w:szCs w:val="16"/>
         </w:rPr>
         <w:t xml:space="preserve">, najpewniej nie przejdzie przeglądu technicznego i </w:t>
       </w:r>
       <w:r>
         <w:rPr>
-          <w:sz w:val="18"/>
-          <w:szCs w:val="18"/>
+          <w:sz w:val="16"/>
+          <w:szCs w:val="16"/>
         </w:rPr>
         <w:t xml:space="preserve">wkrótce </w:t>
       </w:r>
       <w:r>
         <w:rPr>
-          <w:sz w:val="18"/>
-          <w:szCs w:val="18"/>
+          <w:sz w:val="16"/>
+          <w:szCs w:val="16"/>
         </w:rPr>
         <w:t>powinien być traktowany jako zasób części.</w:t>
       </w:r>
@@ -13596,133 +13598,133 @@
         <w:ind w:left="142" w:right="-6" w:hanging="218"/>
         <w:jc w:val="both"/>
         <w:rPr>
-          <w:sz w:val="18"/>
-          <w:szCs w:val="18"/>
+          <w:sz w:val="16"/>
+          <w:szCs w:val="16"/>
         </w:rPr>
       </w:pPr>
       <w:r>
         <w:rPr>
-          <w:sz w:val="18"/>
-          <w:szCs w:val="18"/>
+          <w:sz w:val="16"/>
+          <w:szCs w:val="16"/>
         </w:rPr>
         <w:t>Jeżeli oznaczono</w:t>
       </w:r>
       <w:r>
         <w:rPr>
-          <w:sz w:val="18"/>
-          <w:szCs w:val="18"/>
+          <w:sz w:val="16"/>
+          <w:szCs w:val="16"/>
         </w:rPr>
         <w:t xml:space="preserve"> </w:t>
       </w:r>
       <w:r>
         <w:rPr>
-          <w:sz w:val="18"/>
-          <w:szCs w:val="18"/>
+          <w:sz w:val="16"/>
+          <w:szCs w:val="16"/>
         </w:rPr>
         <w:t xml:space="preserve">oznaki przebiegu wyższego </w:t>
       </w:r>
       <w:r>
         <w:rPr>
-          <w:sz w:val="18"/>
-          <w:szCs w:val="18"/>
+          <w:sz w:val="16"/>
+          <w:szCs w:val="16"/>
         </w:rPr>
         <w:t>od</w:t>
       </w:r>
       <w:r>
         <w:rPr>
-          <w:sz w:val="18"/>
-          <w:szCs w:val="18"/>
+          <w:sz w:val="16"/>
+          <w:szCs w:val="16"/>
         </w:rPr>
         <w:t xml:space="preserve"> drogomierza oznacza to, że Sprzedawca stwierdził, że najprawdopodobniej przebieg Pojazdu nie odpowiada bieżącemu </w:t>
       </w:r>
       <w:r>
         <w:rPr>
-          <w:sz w:val="18"/>
-          <w:szCs w:val="18"/>
+          <w:sz w:val="16"/>
+          <w:szCs w:val="16"/>
         </w:rPr>
         <w:t>wskazaniu</w:t>
       </w:r>
       <w:r>
         <w:rPr>
-          <w:sz w:val="18"/>
-          <w:szCs w:val="18"/>
+          <w:sz w:val="16"/>
+          <w:szCs w:val="16"/>
         </w:rPr>
         <w:t xml:space="preserve"> drogomierza, </w:t>
       </w:r>
       <w:r>
         <w:rPr>
-          <w:sz w:val="18"/>
-          <w:szCs w:val="18"/>
+          <w:sz w:val="16"/>
+          <w:szCs w:val="16"/>
         </w:rPr>
         <w:t xml:space="preserve">bo jest wyższy, </w:t>
       </w:r>
       <w:r>
         <w:rPr>
-          <w:sz w:val="18"/>
-          <w:szCs w:val="18"/>
+          <w:sz w:val="16"/>
+          <w:szCs w:val="16"/>
         </w:rPr>
         <w:t>uwzględni</w:t>
       </w:r>
       <w:r>
         <w:rPr>
-          <w:sz w:val="18"/>
-          <w:szCs w:val="18"/>
+          <w:sz w:val="16"/>
+          <w:szCs w:val="16"/>
         </w:rPr>
         <w:t>ono</w:t>
       </w:r>
       <w:r>
         <w:rPr>
-          <w:sz w:val="18"/>
-          <w:szCs w:val="18"/>
+          <w:sz w:val="16"/>
+          <w:szCs w:val="16"/>
         </w:rPr>
         <w:t xml:space="preserve"> to w </w:t>
       </w:r>
       <w:r>
         <w:rPr>
-          <w:sz w:val="18"/>
-          <w:szCs w:val="18"/>
+          <w:sz w:val="16"/>
+          <w:szCs w:val="16"/>
         </w:rPr>
         <w:t>obniżonej</w:t>
       </w:r>
       <w:r>
         <w:rPr>
-          <w:sz w:val="18"/>
-          <w:szCs w:val="18"/>
+          <w:sz w:val="16"/>
+          <w:szCs w:val="16"/>
         </w:rPr>
         <w:t xml:space="preserve"> </w:t>
       </w:r>
       <w:r>
         <w:rPr>
-          <w:sz w:val="18"/>
-          <w:szCs w:val="18"/>
+          <w:sz w:val="16"/>
+          <w:szCs w:val="16"/>
         </w:rPr>
         <w:t xml:space="preserve">cenie sprzedaży Pojazdu </w:t>
       </w:r>
       <w:r>
         <w:rPr>
-          <w:sz w:val="18"/>
-          <w:szCs w:val="18"/>
+          <w:sz w:val="16"/>
+          <w:szCs w:val="16"/>
         </w:rPr>
         <w:br/>
       </w:r>
       <w:r>
         <w:rPr>
-          <w:sz w:val="18"/>
-          <w:szCs w:val="18"/>
+          <w:sz w:val="16"/>
+          <w:szCs w:val="16"/>
         </w:rPr>
         <w:t xml:space="preserve">i o takiej właściwości Pojazdu </w:t>
       </w:r>
       <w:r>
         <w:rPr>
-          <w:sz w:val="18"/>
-          <w:szCs w:val="18"/>
+          <w:sz w:val="16"/>
+          <w:szCs w:val="16"/>
         </w:rPr>
         <w:t xml:space="preserve">Sprzedawca </w:t>
       </w:r>
       <w:r>
         <w:rPr>
-          <w:sz w:val="18"/>
-          <w:szCs w:val="18"/>
+          <w:sz w:val="16"/>
+          <w:szCs w:val="16"/>
         </w:rPr>
         <w:t>informuje w tym momencie przy sprzedaży.</w:t>
       </w:r>
@@ -15199,39 +15201,6 @@
         </w:p>
       </w:sdtContent>
     </w:sdt>
-    <w:p>
-      <w:pPr>
-        <w:widowControl w:val="0"/>
-        <w:tabs>
-          <w:tab w:val="center" w:pos="2552"/>
-          <w:tab w:val="center" w:pos="7088"/>
-        </w:tabs>
-        <w:autoSpaceDE w:val="0"/>
-        <w:autoSpaceDN w:val="0"/>
-        <w:adjustRightInd w:val="0"/>
-        <w:jc w:val="both"/>
-        <w:rPr>
-          <w:color w:val="000000"/>
-          <w:sz w:val="22"/>
-        </w:rPr>
-      </w:pPr>
-      <w:r>
-        <w:rPr>
-          <w:color w:val="000000"/>
-          <w:sz w:val="22"/>
-        </w:rPr>
-        <w:tab/>
-        <w:t xml:space="preserve">__________________________ </w:t>
-      </w:r>
-      <w:r>
-        <w:rPr>
-          <w:color w:val="000000"/>
-          <w:sz w:val="22"/>
-        </w:rPr>
-        <w:tab/>
-        <w:t>_________________________</w:t>
-      </w:r>
-    </w:p>
     <w:p>
       <w:pPr>
         <w:widowControl w:val="0"/>

</xml_diff>

<commit_message>
Add sale contract signature lines
</commit_message>
<xml_diff>
--- a/contract-pdf-work/templates/Umowa_Sprzedazy_AG_template.docx
+++ b/contract-pdf-work/templates/Umowa_Sprzedazy_AG_template.docx
@@ -15203,27 +15203,15 @@
     </w:sdt>
     <w:p>
       <w:pPr>
-        <w:widowControl w:val="0"/>
-        <w:tabs>
-          <w:tab w:val="center" w:pos="2552"/>
-          <w:tab w:val="center" w:pos="7088"/>
-        </w:tabs>
-        <w:autoSpaceDE w:val="0"/>
-        <w:autoSpaceDN w:val="0"/>
-        <w:adjustRightInd w:val="0"/>
-        <w:jc w:val="both"/>
-        <w:rPr>
-          <w:color w:val="000000"/>
-          <w:sz w:val="4"/>
-          <w:szCs w:val="4"/>
-        </w:rPr>
+        <w:jc w:val="center"/>
+        <w:spacing w:before="260" w:after="0"/>
       </w:pPr>
       <w:r>
         <w:rPr>
-          <w:color w:val="000000"/>
           <w:sz w:val="22"/>
-        </w:rPr>
-        <w:tab/>
+          <w:szCs w:val="22"/>
+        </w:rPr>
+        <w:t xml:space="preserve">__________________________                              _________________________</w:t>
       </w:r>
     </w:p>
     <w:p>
@@ -15236,7 +15224,6 @@
         <w:autoSpaceDE w:val="0"/>
         <w:autoSpaceDN w:val="0"/>
         <w:adjustRightInd w:val="0"/>
-        <w:jc w:val="both"/>
         <w:rPr>
           <w:color w:val="000000"/>
           <w:sz w:val="22"/>
@@ -15248,6 +15235,8 @@
           <w:cols w:space="708"/>
           <w:docGrid w:linePitch="360"/>
         </w:sectPr>
+        <w:jc w:val="center"/>
+        <w:spacing w:before="0" w:after="0"/>
       </w:pPr>
       <w:r>
         <w:rPr>

</xml_diff>